<commit_message>
Remove drafting notes and resolve attestation placeholder
- Final Incident Report: remove trailing drafting-notes paragraph
- PAIN Rating Scoring Rubric: remove drafting-notes paragraph; tidy review cadence wording
- Passwordless MFA Attestation: resolve YubiKey scope placeholder to all staff;
  replace pre-submission recommendation with reference to Trust Center evidence

Co-Authored-By: Claude Opus 5.5 <noreply@anthropic.com>
Claude-Session: https://claude.ai/code/session_01QqdRwbgxpbgZLeo3nnYUym
</commit_message>
<xml_diff>
--- a/JupiterOne_Example_Final_Incident_Report.docx
+++ b/JupiterOne_Example_Final_Incident_Report.docx
@@ -902,14 +902,6 @@
         </w:pBdr>
         <w:spacing w:after="200" w:before="300"/>
       </w:pPr>
-    </w:p>
-    <w:p>
-      <w:pPr>
-        <w:spacing w:after="150"/>
-      </w:pPr>
-      <w:r>
-        <w:t xml:space="preserve">Drafting notes (delete before use): Satisfies IEC-CSO-FIR. File once an incident — previously reported via an Initial Incident Report and any Ongoing Incident Reports — is fully resolved. This template intentionally uses the same tracking ID convention (EXAMPLE-2027-002) as the accompanying Initial and Ongoing Incident Report examples, so all three documents tell one consistent, closed-out incident story rather than three unrelated illustrative examples.</w:t>
-      </w:r>
     </w:p>
     <w:sectPr>
       <w:pgSz w:w="12240" w:h="15840" w:orient="portrait"/>

</xml_diff>